<commit_message>
docs: embed prototype screenshots into marketplace report (Annex A.2)
</commit_message>
<xml_diff>
--- a/docs/Informe-Analisis-Situacional-EMarketplace.docx
+++ b/docs/Informe-Analisis-Situacional-EMarketplace.docx
@@ -6337,135 +6337,458 @@
     </w:p>
     <w:p>
       <w:pPr>
-        <w:pStyle w:val="ListParagraph"/>
-        <w:numPr>
-          <w:ilvl w:val="0"/>
-          <w:numId w:val="3"/>
-        </w:numPr>
-        <w:spacing w:after="80" w:line="276"/>
-      </w:pPr>
-      <w:r>
-        <w:rPr>
-          <w:rFonts w:ascii="Calibri" w:cs="Calibri" w:eastAsia="Calibri" w:hAnsi="Calibri"/>
-          <w:color w:val="2B2420"/>
-          <w:sz w:val="22"/>
-          <w:szCs w:val="22"/>
-        </w:rPr>
-        <w:t xml:space="preserve">/vendedor/registro — auto-registro de tienda de artesano.</w:t>
-      </w:r>
-    </w:p>
-    <w:p>
-      <w:pPr>
-        <w:pStyle w:val="ListParagraph"/>
-        <w:numPr>
-          <w:ilvl w:val="0"/>
-          <w:numId w:val="3"/>
-        </w:numPr>
-        <w:spacing w:after="80" w:line="276"/>
-      </w:pPr>
-      <w:r>
-        <w:rPr>
-          <w:rFonts w:ascii="Calibri" w:cs="Calibri" w:eastAsia="Calibri" w:hAnsi="Calibri"/>
-          <w:color w:val="2B2420"/>
-          <w:sz w:val="22"/>
-          <w:szCs w:val="22"/>
-        </w:rPr>
-        <w:t xml:space="preserve">/vendedor — panel del vendedor (métricas de productos, pedidos, ingresos).</w:t>
-      </w:r>
-    </w:p>
-    <w:p>
-      <w:pPr>
-        <w:pStyle w:val="ListParagraph"/>
-        <w:numPr>
-          <w:ilvl w:val="0"/>
-          <w:numId w:val="3"/>
-        </w:numPr>
-        <w:spacing w:after="80" w:line="276"/>
-      </w:pPr>
-      <w:r>
-        <w:rPr>
-          <w:rFonts w:ascii="Calibri" w:cs="Calibri" w:eastAsia="Calibri" w:hAnsi="Calibri"/>
-          <w:color w:val="2B2420"/>
-          <w:sz w:val="22"/>
-          <w:szCs w:val="22"/>
-        </w:rPr>
-        <w:t xml:space="preserve">/vendedor/productos — CRUD de productos propios.</w:t>
-      </w:r>
-    </w:p>
-    <w:p>
-      <w:pPr>
-        <w:pStyle w:val="ListParagraph"/>
-        <w:numPr>
-          <w:ilvl w:val="0"/>
-          <w:numId w:val="3"/>
-        </w:numPr>
-        <w:spacing w:after="80" w:line="276"/>
-      </w:pPr>
-      <w:r>
-        <w:rPr>
-          <w:rFonts w:ascii="Calibri" w:cs="Calibri" w:eastAsia="Calibri" w:hAnsi="Calibri"/>
-          <w:color w:val="2B2420"/>
-          <w:sz w:val="22"/>
-          <w:szCs w:val="22"/>
-        </w:rPr>
-        <w:t xml:space="preserve">/vendedor/ventas — ventas con bruto, comisión y neto.</w:t>
-      </w:r>
-    </w:p>
-    <w:p>
-      <w:pPr>
-        <w:pStyle w:val="ListParagraph"/>
-        <w:numPr>
-          <w:ilvl w:val="0"/>
-          <w:numId w:val="3"/>
-        </w:numPr>
-        <w:spacing w:after="80" w:line="276"/>
-      </w:pPr>
-      <w:r>
-        <w:rPr>
-          <w:rFonts w:ascii="Calibri" w:cs="Calibri" w:eastAsia="Calibri" w:hAnsi="Calibri"/>
-          <w:color w:val="2B2420"/>
-          <w:sz w:val="22"/>
-          <w:szCs w:val="22"/>
-        </w:rPr>
-        <w:t xml:space="preserve">/tienda — catálogo agregado con chip "Vendido por [tienda]".</w:t>
-      </w:r>
-    </w:p>
-    <w:p>
-      <w:pPr>
-        <w:pStyle w:val="ListParagraph"/>
-        <w:numPr>
-          <w:ilvl w:val="0"/>
-          <w:numId w:val="3"/>
-        </w:numPr>
-        <w:spacing w:after="80" w:line="276"/>
-      </w:pPr>
-      <w:r>
-        <w:rPr>
-          <w:rFonts w:ascii="Calibri" w:cs="Calibri" w:eastAsia="Calibri" w:hAnsi="Calibri"/>
-          <w:color w:val="2B2420"/>
-          <w:sz w:val="22"/>
-          <w:szCs w:val="22"/>
-        </w:rPr>
-        <w:t xml:space="preserve">/tienda/vendedor/:id — tienda pública de un vendedor.</w:t>
-      </w:r>
-    </w:p>
-    <w:p>
-      <w:pPr>
-        <w:pStyle w:val="ListParagraph"/>
-        <w:numPr>
-          <w:ilvl w:val="0"/>
-          <w:numId w:val="3"/>
-        </w:numPr>
-        <w:spacing w:after="80" w:line="276"/>
-      </w:pPr>
-      <w:r>
-        <w:rPr>
-          <w:rFonts w:ascii="Calibri" w:cs="Calibri" w:eastAsia="Calibri" w:hAnsi="Calibri"/>
-          <w:color w:val="2B2420"/>
-          <w:sz w:val="22"/>
-          <w:szCs w:val="22"/>
-        </w:rPr>
-        <w:t xml:space="preserve">/admin/vendedores — panel Vendedores &amp; Comisiones (tasa %, liquidación por vendedor, suspender/activar).</w:t>
+        <w:spacing w:after="140" w:line="288"/>
+      </w:pPr>
+      <w:r>
+        <w:rPr>
+          <w:rFonts w:ascii="Calibri" w:cs="Calibri" w:eastAsia="Calibri" w:hAnsi="Calibri"/>
+          <w:color w:val="2B2420"/>
+          <w:sz w:val="22"/>
+          <w:szCs w:val="22"/>
+        </w:rPr>
+        <w:t xml:space="preserve">Capturas del despliegue en producción (ecoandes-react.vercel.app):</w:t>
+      </w:r>
+    </w:p>
+    <w:p>
+      <w:pPr>
+        <w:spacing w:after="40" w:before="140"/>
+        <w:jc w:val="center"/>
+      </w:pPr>
+      <w:r>
+        <w:drawing>
+          <wp:inline distT="0" distB="0" distL="0" distR="0">
+            <wp:extent cx="5715000" cy="3571875"/>
+            <wp:effectExtent t="0" r="0" b="0" l="0"/>
+            <wp:docPr id="1" name="" descr="" title=""/>
+            <wp:cNvGraphicFramePr>
+              <a:graphicFrameLocks xmlns:a="http://schemas.openxmlformats.org/drawingml/2006/main" noChangeAspect="1"/>
+            </wp:cNvGraphicFramePr>
+            <a:graphic xmlns:a="http://schemas.openxmlformats.org/drawingml/2006/main">
+              <a:graphicData uri="http://schemas.openxmlformats.org/drawingml/2006/picture">
+                <pic:pic xmlns:pic="http://schemas.openxmlformats.org/drawingml/2006/picture">
+                  <pic:nvPicPr>
+                    <pic:cNvPr id="0" name="" descr=""/>
+                    <pic:cNvPicPr>
+                      <a:picLocks noChangeAspect="1" noChangeArrowheads="1"/>
+                    </pic:cNvPicPr>
+                  </pic:nvPicPr>
+                  <pic:blipFill>
+                    <a:blip r:embed="rId7" cstate="none"/>
+                    <a:srcRect/>
+                    <a:stretch>
+                      <a:fillRect/>
+                    </a:stretch>
+                  </pic:blipFill>
+                  <pic:spPr bwMode="auto">
+                    <a:xfrm>
+                      <a:off x="0" y="0"/>
+                      <a:ext cx="5715000" cy="3571875"/>
+                    </a:xfrm>
+                    <a:prstGeom prst="rect">
+                      <a:avLst/>
+                    </a:prstGeom>
+                  </pic:spPr>
+                </pic:pic>
+              </a:graphicData>
+            </a:graphic>
+          </wp:inline>
+        </w:drawing>
+      </w:r>
+    </w:p>
+    <w:p>
+      <w:pPr>
+        <w:spacing w:after="200"/>
+        <w:jc w:val="center"/>
+      </w:pPr>
+      <w:r>
+        <w:rPr>
+          <w:i/>
+          <w:iCs/>
+          <w:color w:val="6B6058"/>
+          <w:sz w:val="18"/>
+          <w:szCs w:val="18"/>
+        </w:rPr>
+        <w:t xml:space="preserve">Figura 1. Portada del marketplace EcoAndes — ruta /</w:t>
+      </w:r>
+    </w:p>
+    <w:p>
+      <w:pPr>
+        <w:spacing w:after="40" w:before="140"/>
+        <w:jc w:val="center"/>
+      </w:pPr>
+      <w:r>
+        <w:drawing>
+          <wp:inline distT="0" distB="0" distL="0" distR="0">
+            <wp:extent cx="5715000" cy="3571875"/>
+            <wp:effectExtent t="0" r="0" b="0" l="0"/>
+            <wp:docPr id="1" name="" descr="" title=""/>
+            <wp:cNvGraphicFramePr>
+              <a:graphicFrameLocks xmlns:a="http://schemas.openxmlformats.org/drawingml/2006/main" noChangeAspect="1"/>
+            </wp:cNvGraphicFramePr>
+            <a:graphic xmlns:a="http://schemas.openxmlformats.org/drawingml/2006/main">
+              <a:graphicData uri="http://schemas.openxmlformats.org/drawingml/2006/picture">
+                <pic:pic xmlns:pic="http://schemas.openxmlformats.org/drawingml/2006/picture">
+                  <pic:nvPicPr>
+                    <pic:cNvPr id="0" name="" descr=""/>
+                    <pic:cNvPicPr>
+                      <a:picLocks noChangeAspect="1" noChangeArrowheads="1"/>
+                    </pic:cNvPicPr>
+                  </pic:nvPicPr>
+                  <pic:blipFill>
+                    <a:blip r:embed="rId8" cstate="none"/>
+                    <a:srcRect/>
+                    <a:stretch>
+                      <a:fillRect/>
+                    </a:stretch>
+                  </pic:blipFill>
+                  <pic:spPr bwMode="auto">
+                    <a:xfrm>
+                      <a:off x="0" y="0"/>
+                      <a:ext cx="5715000" cy="3571875"/>
+                    </a:xfrm>
+                    <a:prstGeom prst="rect">
+                      <a:avLst/>
+                    </a:prstGeom>
+                  </pic:spPr>
+                </pic:pic>
+              </a:graphicData>
+            </a:graphic>
+          </wp:inline>
+        </w:drawing>
+      </w:r>
+    </w:p>
+    <w:p>
+      <w:pPr>
+        <w:spacing w:after="200"/>
+        <w:jc w:val="center"/>
+      </w:pPr>
+      <w:r>
+        <w:rPr>
+          <w:i/>
+          <w:iCs/>
+          <w:color w:val="6B6058"/>
+          <w:sz w:val="18"/>
+          <w:szCs w:val="18"/>
+        </w:rPr>
+        <w:t xml:space="preserve">Figura 2. Catálogo agregado (25 productos) — ruta /tienda</w:t>
+      </w:r>
+    </w:p>
+    <w:p>
+      <w:pPr>
+        <w:spacing w:after="40" w:before="140"/>
+        <w:jc w:val="center"/>
+      </w:pPr>
+      <w:r>
+        <w:drawing>
+          <wp:inline distT="0" distB="0" distL="0" distR="0">
+            <wp:extent cx="5715000" cy="3571875"/>
+            <wp:effectExtent t="0" r="0" b="0" l="0"/>
+            <wp:docPr id="1" name="" descr="" title=""/>
+            <wp:cNvGraphicFramePr>
+              <a:graphicFrameLocks xmlns:a="http://schemas.openxmlformats.org/drawingml/2006/main" noChangeAspect="1"/>
+            </wp:cNvGraphicFramePr>
+            <a:graphic xmlns:a="http://schemas.openxmlformats.org/drawingml/2006/main">
+              <a:graphicData uri="http://schemas.openxmlformats.org/drawingml/2006/picture">
+                <pic:pic xmlns:pic="http://schemas.openxmlformats.org/drawingml/2006/picture">
+                  <pic:nvPicPr>
+                    <pic:cNvPr id="0" name="" descr=""/>
+                    <pic:cNvPicPr>
+                      <a:picLocks noChangeAspect="1" noChangeArrowheads="1"/>
+                    </pic:cNvPicPr>
+                  </pic:nvPicPr>
+                  <pic:blipFill>
+                    <a:blip r:embed="rId9" cstate="none"/>
+                    <a:srcRect/>
+                    <a:stretch>
+                      <a:fillRect/>
+                    </a:stretch>
+                  </pic:blipFill>
+                  <pic:spPr bwMode="auto">
+                    <a:xfrm>
+                      <a:off x="0" y="0"/>
+                      <a:ext cx="5715000" cy="3571875"/>
+                    </a:xfrm>
+                    <a:prstGeom prst="rect">
+                      <a:avLst/>
+                    </a:prstGeom>
+                  </pic:spPr>
+                </pic:pic>
+              </a:graphicData>
+            </a:graphic>
+          </wp:inline>
+        </w:drawing>
+      </w:r>
+    </w:p>
+    <w:p>
+      <w:pPr>
+        <w:spacing w:after="200"/>
+        <w:jc w:val="center"/>
+      </w:pPr>
+      <w:r>
+        <w:rPr>
+          <w:i/>
+          <w:iCs/>
+          <w:color w:val="6B6058"/>
+          <w:sz w:val="18"/>
+          <w:szCs w:val="18"/>
+        </w:rPr>
+        <w:t xml:space="preserve">Figura 3. Acceso al registro de tienda de artesano — ruta /vendedor/registro</w:t>
+      </w:r>
+    </w:p>
+    <w:p>
+      <w:pPr>
+        <w:spacing w:after="40" w:before="140"/>
+        <w:jc w:val="center"/>
+      </w:pPr>
+      <w:r>
+        <w:drawing>
+          <wp:inline distT="0" distB="0" distL="0" distR="0">
+            <wp:extent cx="5715000" cy="3571875"/>
+            <wp:effectExtent t="0" r="0" b="0" l="0"/>
+            <wp:docPr id="1" name="" descr="" title=""/>
+            <wp:cNvGraphicFramePr>
+              <a:graphicFrameLocks xmlns:a="http://schemas.openxmlformats.org/drawingml/2006/main" noChangeAspect="1"/>
+            </wp:cNvGraphicFramePr>
+            <a:graphic xmlns:a="http://schemas.openxmlformats.org/drawingml/2006/main">
+              <a:graphicData uri="http://schemas.openxmlformats.org/drawingml/2006/picture">
+                <pic:pic xmlns:pic="http://schemas.openxmlformats.org/drawingml/2006/picture">
+                  <pic:nvPicPr>
+                    <pic:cNvPr id="0" name="" descr=""/>
+                    <pic:cNvPicPr>
+                      <a:picLocks noChangeAspect="1" noChangeArrowheads="1"/>
+                    </pic:cNvPicPr>
+                  </pic:nvPicPr>
+                  <pic:blipFill>
+                    <a:blip r:embed="rId10" cstate="none"/>
+                    <a:srcRect/>
+                    <a:stretch>
+                      <a:fillRect/>
+                    </a:stretch>
+                  </pic:blipFill>
+                  <pic:spPr bwMode="auto">
+                    <a:xfrm>
+                      <a:off x="0" y="0"/>
+                      <a:ext cx="5715000" cy="3571875"/>
+                    </a:xfrm>
+                    <a:prstGeom prst="rect">
+                      <a:avLst/>
+                    </a:prstGeom>
+                  </pic:spPr>
+                </pic:pic>
+              </a:graphicData>
+            </a:graphic>
+          </wp:inline>
+        </w:drawing>
+      </w:r>
+    </w:p>
+    <w:p>
+      <w:pPr>
+        <w:spacing w:after="200"/>
+        <w:jc w:val="center"/>
+      </w:pPr>
+      <w:r>
+        <w:rPr>
+          <w:i/>
+          <w:iCs/>
+          <w:color w:val="6B6058"/>
+          <w:sz w:val="18"/>
+          <w:szCs w:val="18"/>
+        </w:rPr>
+        <w:t xml:space="preserve">Figura 4. Dashboard administrativo — ruta /admin</w:t>
+      </w:r>
+    </w:p>
+    <w:p>
+      <w:pPr>
+        <w:spacing w:after="40" w:before="140"/>
+        <w:jc w:val="center"/>
+      </w:pPr>
+      <w:r>
+        <w:drawing>
+          <wp:inline distT="0" distB="0" distL="0" distR="0">
+            <wp:extent cx="5715000" cy="3571875"/>
+            <wp:effectExtent t="0" r="0" b="0" l="0"/>
+            <wp:docPr id="1" name="" descr="" title=""/>
+            <wp:cNvGraphicFramePr>
+              <a:graphicFrameLocks xmlns:a="http://schemas.openxmlformats.org/drawingml/2006/main" noChangeAspect="1"/>
+            </wp:cNvGraphicFramePr>
+            <a:graphic xmlns:a="http://schemas.openxmlformats.org/drawingml/2006/main">
+              <a:graphicData uri="http://schemas.openxmlformats.org/drawingml/2006/picture">
+                <pic:pic xmlns:pic="http://schemas.openxmlformats.org/drawingml/2006/picture">
+                  <pic:nvPicPr>
+                    <pic:cNvPr id="0" name="" descr=""/>
+                    <pic:cNvPicPr>
+                      <a:picLocks noChangeAspect="1" noChangeArrowheads="1"/>
+                    </pic:cNvPicPr>
+                  </pic:nvPicPr>
+                  <pic:blipFill>
+                    <a:blip r:embed="rId11" cstate="none"/>
+                    <a:srcRect/>
+                    <a:stretch>
+                      <a:fillRect/>
+                    </a:stretch>
+                  </pic:blipFill>
+                  <pic:spPr bwMode="auto">
+                    <a:xfrm>
+                      <a:off x="0" y="0"/>
+                      <a:ext cx="5715000" cy="3571875"/>
+                    </a:xfrm>
+                    <a:prstGeom prst="rect">
+                      <a:avLst/>
+                    </a:prstGeom>
+                  </pic:spPr>
+                </pic:pic>
+              </a:graphicData>
+            </a:graphic>
+          </wp:inline>
+        </w:drawing>
+      </w:r>
+    </w:p>
+    <w:p>
+      <w:pPr>
+        <w:spacing w:after="200"/>
+        <w:jc w:val="center"/>
+      </w:pPr>
+      <w:r>
+        <w:rPr>
+          <w:i/>
+          <w:iCs/>
+          <w:color w:val="6B6058"/>
+          <w:sz w:val="18"/>
+          <w:szCs w:val="18"/>
+        </w:rPr>
+        <w:t xml:space="preserve">Figura 5. Panel Vendedores &amp; Comisiones: tasa configurable y liquidación por vendedor — ruta /admin/vendedores</w:t>
+      </w:r>
+    </w:p>
+    <w:p>
+      <w:pPr>
+        <w:spacing w:after="40" w:before="140"/>
+        <w:jc w:val="center"/>
+      </w:pPr>
+      <w:r>
+        <w:drawing>
+          <wp:inline distT="0" distB="0" distL="0" distR="0">
+            <wp:extent cx="5715000" cy="3571875"/>
+            <wp:effectExtent t="0" r="0" b="0" l="0"/>
+            <wp:docPr id="1" name="" descr="" title=""/>
+            <wp:cNvGraphicFramePr>
+              <a:graphicFrameLocks xmlns:a="http://schemas.openxmlformats.org/drawingml/2006/main" noChangeAspect="1"/>
+            </wp:cNvGraphicFramePr>
+            <a:graphic xmlns:a="http://schemas.openxmlformats.org/drawingml/2006/main">
+              <a:graphicData uri="http://schemas.openxmlformats.org/drawingml/2006/picture">
+                <pic:pic xmlns:pic="http://schemas.openxmlformats.org/drawingml/2006/picture">
+                  <pic:nvPicPr>
+                    <pic:cNvPr id="0" name="" descr=""/>
+                    <pic:cNvPicPr>
+                      <a:picLocks noChangeAspect="1" noChangeArrowheads="1"/>
+                    </pic:cNvPicPr>
+                  </pic:nvPicPr>
+                  <pic:blipFill>
+                    <a:blip r:embed="rId12" cstate="none"/>
+                    <a:srcRect/>
+                    <a:stretch>
+                      <a:fillRect/>
+                    </a:stretch>
+                  </pic:blipFill>
+                  <pic:spPr bwMode="auto">
+                    <a:xfrm>
+                      <a:off x="0" y="0"/>
+                      <a:ext cx="5715000" cy="3571875"/>
+                    </a:xfrm>
+                    <a:prstGeom prst="rect">
+                      <a:avLst/>
+                    </a:prstGeom>
+                  </pic:spPr>
+                </pic:pic>
+              </a:graphicData>
+            </a:graphic>
+          </wp:inline>
+        </w:drawing>
+      </w:r>
+    </w:p>
+    <w:p>
+      <w:pPr>
+        <w:spacing w:after="200"/>
+        <w:jc w:val="center"/>
+      </w:pPr>
+      <w:r>
+        <w:rPr>
+          <w:i/>
+          <w:iCs/>
+          <w:color w:val="6B6058"/>
+          <w:sz w:val="18"/>
+          <w:szCs w:val="18"/>
+        </w:rPr>
+        <w:t xml:space="preserve">Figura 6. Reportes CRM (nuevos clientes, campañas, promociones, sugerencias, reclamos) — ruta /admin/reportes</w:t>
+      </w:r>
+    </w:p>
+    <w:p>
+      <w:pPr>
+        <w:spacing w:after="120"/>
+      </w:pPr>
+    </w:p>
+    <w:p>
+      <w:pPr>
+        <w:spacing w:after="140" w:line="288"/>
+      </w:pPr>
+      <w:r>
+        <w:rPr>
+          <w:rFonts w:ascii="Calibri" w:cs="Calibri" w:eastAsia="Calibri" w:hAnsi="Calibri"/>
+          <w:b/>
+          <w:bCs/>
+          <w:color w:val="2B2420"/>
+          <w:sz w:val="22"/>
+          <w:szCs w:val="22"/>
+        </w:rPr>
+        <w:t xml:space="preserve">Nota: </w:t>
+      </w:r>
+      <w:r>
+        <w:rPr>
+          <w:rFonts w:ascii="Calibri" w:cs="Calibri" w:eastAsia="Calibri" w:hAnsi="Calibri"/>
+          <w:color w:val="2B2420"/>
+          <w:sz w:val="22"/>
+          <w:szCs w:val="22"/>
+        </w:rPr>
+        <w:t xml:space="preserve">las vistas del portal del vendedor (</w:t>
+      </w:r>
+      <w:r>
+        <w:rPr>
+          <w:rFonts w:ascii="Calibri" w:cs="Calibri" w:eastAsia="Calibri" w:hAnsi="Calibri"/>
+          <w:i/>
+          <w:iCs/>
+          <w:color w:val="2B2420"/>
+          <w:sz w:val="22"/>
+          <w:szCs w:val="22"/>
+        </w:rPr>
+        <w:t xml:space="preserve">/vendedor/productos</w:t>
+      </w:r>
+      <w:r>
+        <w:rPr>
+          <w:rFonts w:ascii="Calibri" w:cs="Calibri" w:eastAsia="Calibri" w:hAnsi="Calibri"/>
+          <w:color w:val="2B2420"/>
+          <w:sz w:val="22"/>
+          <w:szCs w:val="22"/>
+        </w:rPr>
+        <w:t xml:space="preserve"> y </w:t>
+      </w:r>
+      <w:r>
+        <w:rPr>
+          <w:rFonts w:ascii="Calibri" w:cs="Calibri" w:eastAsia="Calibri" w:hAnsi="Calibri"/>
+          <w:i/>
+          <w:iCs/>
+          <w:color w:val="2B2420"/>
+          <w:sz w:val="22"/>
+          <w:szCs w:val="22"/>
+        </w:rPr>
+        <w:t xml:space="preserve">/vendedor/ventas</w:t>
+      </w:r>
+      <w:r>
+        <w:rPr>
+          <w:rFonts w:ascii="Calibri" w:cs="Calibri" w:eastAsia="Calibri" w:hAnsi="Calibri"/>
+          <w:color w:val="2B2420"/>
+          <w:sz w:val="22"/>
+          <w:szCs w:val="22"/>
+        </w:rPr>
+        <w:t xml:space="preserve">), que requieren una sesión con rol vendedor, se anexan al registrar una tienda de prueba.</w:t>
       </w:r>
     </w:p>
     <w:sectPr>

</xml_diff>

<commit_message>
docs: add external marketplace screenshots to report (Annex A.1)
Captured Mercado Libre, Etsy, Amazon, Alibaba and Novica home pages and
embedded them as APA figures 1-5; prototype figures renumbered 6-11.
</commit_message>
<xml_diff>
--- a/docs/Informe-Analisis-Situacional-EMarketplace.docx
+++ b/docs/Informe-Analisis-Situacional-EMarketplace.docx
@@ -6138,7 +6138,7 @@
           <w:sz w:val="24"/>
           <w:szCs w:val="24"/>
         </w:rPr>
-        <w:t xml:space="preserve">En este apartado se insertan las capturas de pantalla de los marketplaces externos evaluados (Mercado Libre, Etsy, Novica, Amazon Handmade y Alibaba), correspondientes a sus funcionalidades, paneles de vendedor y esquemas de comisión.</w:t>
+        <w:t xml:space="preserve">Las siguientes figuras corresponden a las páginas de inicio de los marketplaces externos evaluados, en las que se aprecian sus funcionalidades, categorías y opciones de venta.</w:t>
       </w:r>
     </w:p>
     <w:p>
@@ -6154,38 +6154,6 @@
           <w:sz w:val="24"/>
           <w:szCs w:val="24"/>
         </w:rPr>
-        <w:t xml:space="preserve">A.2 Prototipo Propio EcoAndes</w:t>
-      </w:r>
-    </w:p>
-    <w:p>
-      <w:pPr>
-        <w:spacing w:after="0" w:line="480" w:lineRule="auto"/>
-        <w:ind w:firstLine="720"/>
-        <w:jc w:val="both"/>
-      </w:pPr>
-      <w:r>
-        <w:rPr>
-          <w:rFonts w:ascii="Times New Roman" w:cs="Times New Roman" w:eastAsia="Times New Roman" w:hAnsi="Times New Roman"/>
-          <w:color w:val="000000"/>
-          <w:sz w:val="24"/>
-          <w:szCs w:val="24"/>
-        </w:rPr>
-        <w:t xml:space="preserve">Las siguientes figuras documentan el prototipo desplegado en producción (ecoandes-react.vercel.app).</w:t>
-      </w:r>
-    </w:p>
-    <w:p>
-      <w:pPr>
-        <w:spacing w:after="0" w:before="200" w:line="480" w:lineRule="auto"/>
-      </w:pPr>
-      <w:r>
-        <w:rPr>
-          <w:rFonts w:ascii="Times New Roman" w:cs="Times New Roman" w:eastAsia="Times New Roman" w:hAnsi="Times New Roman"/>
-          <w:b/>
-          <w:bCs/>
-          <w:color w:val="000000"/>
-          <w:sz w:val="24"/>
-          <w:szCs w:val="24"/>
-        </w:rPr>
         <w:t xml:space="preserve">Figura 1</w:t>
       </w:r>
     </w:p>
@@ -6202,7 +6170,7 @@
           <w:sz w:val="24"/>
           <w:szCs w:val="24"/>
         </w:rPr>
-        <w:t xml:space="preserve">Portada del marketplace EcoAndes</w:t>
+        <w:t xml:space="preserve">Mercado Libre Perú</w:t>
       </w:r>
     </w:p>
     <w:p>
@@ -6273,7 +6241,7 @@
           <w:sz w:val="20"/>
           <w:szCs w:val="20"/>
         </w:rPr>
-        <w:t xml:space="preserve">Página de inicio de la plataforma, ruta «/».</w:t>
+        <w:t xml:space="preserve">Página de inicio del marketplace horizontal líder en el Perú, con opciones de compra, venta y pago (Yape, Mercado Pago). Tomado de mercadolibre.com.pe.</w:t>
       </w:r>
     </w:p>
     <w:p>
@@ -6305,7 +6273,7 @@
           <w:sz w:val="24"/>
           <w:szCs w:val="24"/>
         </w:rPr>
-        <w:t xml:space="preserve">Catálogo agregado del marketplace</w:t>
+        <w:t xml:space="preserve">Etsy</w:t>
       </w:r>
     </w:p>
     <w:p>
@@ -6376,7 +6344,7 @@
           <w:sz w:val="20"/>
           <w:szCs w:val="20"/>
         </w:rPr>
-        <w:t xml:space="preserve">Vista de la tienda con 25 productos, ruta «/tienda».</w:t>
+        <w:t xml:space="preserve">Página de inicio del marketplace vertical de artesanía y productos hechos a mano. Tomado de etsy.com.</w:t>
       </w:r>
     </w:p>
     <w:p>
@@ -6408,7 +6376,7 @@
           <w:sz w:val="24"/>
           <w:szCs w:val="24"/>
         </w:rPr>
-        <w:t xml:space="preserve">Acceso al registro de tienda de artesano</w:t>
+        <w:t xml:space="preserve">Amazon</w:t>
       </w:r>
     </w:p>
     <w:p>
@@ -6479,7 +6447,7 @@
           <w:sz w:val="20"/>
           <w:szCs w:val="20"/>
         </w:rPr>
-        <w:t xml:space="preserve">Punto de entrada al auto-registro de vendedor, ruta «/vendedor/registro».</w:t>
+        <w:t xml:space="preserve">Marketplace horizontal global; se observa la sección «Gana dinero con nosotros» que incluye el programa de venta para artesanos. Tomado de amazon.com/handmade.</w:t>
       </w:r>
     </w:p>
     <w:p>
@@ -6511,7 +6479,7 @@
           <w:sz w:val="24"/>
           <w:szCs w:val="24"/>
         </w:rPr>
-        <w:t xml:space="preserve">Panel administrativo (dashboard)</w:t>
+        <w:t xml:space="preserve">Alibaba.com</w:t>
       </w:r>
     </w:p>
     <w:p>
@@ -6582,7 +6550,7 @@
           <w:sz w:val="20"/>
           <w:szCs w:val="20"/>
         </w:rPr>
-        <w:t xml:space="preserve">Tablero de indicadores del administrador, ruta «/admin».</w:t>
+        <w:t xml:space="preserve">Marketplace horizontal de comercio entre empresas (B2B), con fabricantes verificados y búsqueda por imagen. Tomado de alibaba.com.</w:t>
       </w:r>
     </w:p>
     <w:p>
@@ -6614,7 +6582,7 @@
           <w:sz w:val="24"/>
           <w:szCs w:val="24"/>
         </w:rPr>
-        <w:t xml:space="preserve">Panel de Vendedores y Comisiones</w:t>
+        <w:t xml:space="preserve">Novica</w:t>
       </w:r>
     </w:p>
     <w:p>
@@ -6685,7 +6653,7 @@
           <w:sz w:val="20"/>
           <w:szCs w:val="20"/>
         </w:rPr>
-        <w:t xml:space="preserve">Configuración de la tasa de comisión y liquidación por vendedor, ruta «/admin/vendedores».</w:t>
+        <w:t xml:space="preserve">Marketplace vertical de artesanía de comercio justo con presencia de artesanos por regiones. Tomado de novica.com.</w:t>
       </w:r>
     </w:p>
     <w:p>
@@ -6701,6 +6669,38 @@
           <w:sz w:val="24"/>
           <w:szCs w:val="24"/>
         </w:rPr>
+        <w:t xml:space="preserve">A.2 Prototipo Propio EcoAndes</w:t>
+      </w:r>
+    </w:p>
+    <w:p>
+      <w:pPr>
+        <w:spacing w:after="0" w:line="480" w:lineRule="auto"/>
+        <w:ind w:firstLine="720"/>
+        <w:jc w:val="both"/>
+      </w:pPr>
+      <w:r>
+        <w:rPr>
+          <w:rFonts w:ascii="Times New Roman" w:cs="Times New Roman" w:eastAsia="Times New Roman" w:hAnsi="Times New Roman"/>
+          <w:color w:val="000000"/>
+          <w:sz w:val="24"/>
+          <w:szCs w:val="24"/>
+        </w:rPr>
+        <w:t xml:space="preserve">Las siguientes figuras documentan el prototipo desplegado en producción (ecoandes-react.vercel.app).</w:t>
+      </w:r>
+    </w:p>
+    <w:p>
+      <w:pPr>
+        <w:spacing w:after="0" w:before="200" w:line="480" w:lineRule="auto"/>
+      </w:pPr>
+      <w:r>
+        <w:rPr>
+          <w:rFonts w:ascii="Times New Roman" w:cs="Times New Roman" w:eastAsia="Times New Roman" w:hAnsi="Times New Roman"/>
+          <w:b/>
+          <w:bCs/>
+          <w:color w:val="000000"/>
+          <w:sz w:val="24"/>
+          <w:szCs w:val="24"/>
+        </w:rPr>
         <w:t xml:space="preserve">Figura 6</w:t>
       </w:r>
     </w:p>
@@ -6717,7 +6717,7 @@
           <w:sz w:val="24"/>
           <w:szCs w:val="24"/>
         </w:rPr>
-        <w:t xml:space="preserve">Reportes del módulo CRM</w:t>
+        <w:t xml:space="preserve">Portada del marketplace EcoAndes</w:t>
       </w:r>
     </w:p>
     <w:p>
@@ -6745,6 +6745,521 @@
                   </pic:nvPicPr>
                   <pic:blipFill>
                     <a:blip r:embed="rId13" cstate="none"/>
+                    <a:srcRect/>
+                    <a:stretch>
+                      <a:fillRect/>
+                    </a:stretch>
+                  </pic:blipFill>
+                  <pic:spPr bwMode="auto">
+                    <a:xfrm>
+                      <a:off x="0" y="0"/>
+                      <a:ext cx="5486400" cy="3429000"/>
+                    </a:xfrm>
+                    <a:prstGeom prst="rect">
+                      <a:avLst/>
+                    </a:prstGeom>
+                  </pic:spPr>
+                </pic:pic>
+              </a:graphicData>
+            </a:graphic>
+          </wp:inline>
+        </w:drawing>
+      </w:r>
+    </w:p>
+    <w:p>
+      <w:pPr>
+        <w:spacing w:after="200" w:line="240" w:lineRule="auto"/>
+      </w:pPr>
+      <w:r>
+        <w:rPr>
+          <w:rFonts w:ascii="Times New Roman" w:cs="Times New Roman" w:eastAsia="Times New Roman" w:hAnsi="Times New Roman"/>
+          <w:i/>
+          <w:iCs/>
+          <w:color w:val="000000"/>
+          <w:sz w:val="20"/>
+          <w:szCs w:val="20"/>
+        </w:rPr>
+        <w:t xml:space="preserve">Nota. </w:t>
+      </w:r>
+      <w:r>
+        <w:rPr>
+          <w:rFonts w:ascii="Times New Roman" w:cs="Times New Roman" w:eastAsia="Times New Roman" w:hAnsi="Times New Roman"/>
+          <w:color w:val="000000"/>
+          <w:sz w:val="20"/>
+          <w:szCs w:val="20"/>
+        </w:rPr>
+        <w:t xml:space="preserve">Página de inicio de la plataforma, ruta «/».</w:t>
+      </w:r>
+    </w:p>
+    <w:p>
+      <w:pPr>
+        <w:spacing w:after="0" w:before="200" w:line="480" w:lineRule="auto"/>
+      </w:pPr>
+      <w:r>
+        <w:rPr>
+          <w:rFonts w:ascii="Times New Roman" w:cs="Times New Roman" w:eastAsia="Times New Roman" w:hAnsi="Times New Roman"/>
+          <w:b/>
+          <w:bCs/>
+          <w:color w:val="000000"/>
+          <w:sz w:val="24"/>
+          <w:szCs w:val="24"/>
+        </w:rPr>
+        <w:t xml:space="preserve">Figura 7</w:t>
+      </w:r>
+    </w:p>
+    <w:p>
+      <w:pPr>
+        <w:spacing w:after="80" w:line="480" w:lineRule="auto"/>
+      </w:pPr>
+      <w:r>
+        <w:rPr>
+          <w:rFonts w:ascii="Times New Roman" w:cs="Times New Roman" w:eastAsia="Times New Roman" w:hAnsi="Times New Roman"/>
+          <w:i/>
+          <w:iCs/>
+          <w:color w:val="000000"/>
+          <w:sz w:val="24"/>
+          <w:szCs w:val="24"/>
+        </w:rPr>
+        <w:t xml:space="preserve">Catálogo agregado del marketplace</w:t>
+      </w:r>
+    </w:p>
+    <w:p>
+      <w:pPr>
+        <w:spacing w:after="40"/>
+        <w:jc w:val="center"/>
+      </w:pPr>
+      <w:r>
+        <w:drawing>
+          <wp:inline distT="0" distB="0" distL="0" distR="0">
+            <wp:extent cx="5486400" cy="3429000"/>
+            <wp:effectExtent t="0" r="0" b="0" l="0"/>
+            <wp:docPr id="1" name="" descr="" title=""/>
+            <wp:cNvGraphicFramePr>
+              <a:graphicFrameLocks xmlns:a="http://schemas.openxmlformats.org/drawingml/2006/main" noChangeAspect="1"/>
+            </wp:cNvGraphicFramePr>
+            <a:graphic xmlns:a="http://schemas.openxmlformats.org/drawingml/2006/main">
+              <a:graphicData uri="http://schemas.openxmlformats.org/drawingml/2006/picture">
+                <pic:pic xmlns:pic="http://schemas.openxmlformats.org/drawingml/2006/picture">
+                  <pic:nvPicPr>
+                    <pic:cNvPr id="0" name="" descr=""/>
+                    <pic:cNvPicPr>
+                      <a:picLocks noChangeAspect="1" noChangeArrowheads="1"/>
+                    </pic:cNvPicPr>
+                  </pic:nvPicPr>
+                  <pic:blipFill>
+                    <a:blip r:embed="rId14" cstate="none"/>
+                    <a:srcRect/>
+                    <a:stretch>
+                      <a:fillRect/>
+                    </a:stretch>
+                  </pic:blipFill>
+                  <pic:spPr bwMode="auto">
+                    <a:xfrm>
+                      <a:off x="0" y="0"/>
+                      <a:ext cx="5486400" cy="3429000"/>
+                    </a:xfrm>
+                    <a:prstGeom prst="rect">
+                      <a:avLst/>
+                    </a:prstGeom>
+                  </pic:spPr>
+                </pic:pic>
+              </a:graphicData>
+            </a:graphic>
+          </wp:inline>
+        </w:drawing>
+      </w:r>
+    </w:p>
+    <w:p>
+      <w:pPr>
+        <w:spacing w:after="200" w:line="240" w:lineRule="auto"/>
+      </w:pPr>
+      <w:r>
+        <w:rPr>
+          <w:rFonts w:ascii="Times New Roman" w:cs="Times New Roman" w:eastAsia="Times New Roman" w:hAnsi="Times New Roman"/>
+          <w:i/>
+          <w:iCs/>
+          <w:color w:val="000000"/>
+          <w:sz w:val="20"/>
+          <w:szCs w:val="20"/>
+        </w:rPr>
+        <w:t xml:space="preserve">Nota. </w:t>
+      </w:r>
+      <w:r>
+        <w:rPr>
+          <w:rFonts w:ascii="Times New Roman" w:cs="Times New Roman" w:eastAsia="Times New Roman" w:hAnsi="Times New Roman"/>
+          <w:color w:val="000000"/>
+          <w:sz w:val="20"/>
+          <w:szCs w:val="20"/>
+        </w:rPr>
+        <w:t xml:space="preserve">Vista de la tienda con 25 productos, ruta «/tienda».</w:t>
+      </w:r>
+    </w:p>
+    <w:p>
+      <w:pPr>
+        <w:spacing w:after="0" w:before="200" w:line="480" w:lineRule="auto"/>
+      </w:pPr>
+      <w:r>
+        <w:rPr>
+          <w:rFonts w:ascii="Times New Roman" w:cs="Times New Roman" w:eastAsia="Times New Roman" w:hAnsi="Times New Roman"/>
+          <w:b/>
+          <w:bCs/>
+          <w:color w:val="000000"/>
+          <w:sz w:val="24"/>
+          <w:szCs w:val="24"/>
+        </w:rPr>
+        <w:t xml:space="preserve">Figura 8</w:t>
+      </w:r>
+    </w:p>
+    <w:p>
+      <w:pPr>
+        <w:spacing w:after="80" w:line="480" w:lineRule="auto"/>
+      </w:pPr>
+      <w:r>
+        <w:rPr>
+          <w:rFonts w:ascii="Times New Roman" w:cs="Times New Roman" w:eastAsia="Times New Roman" w:hAnsi="Times New Roman"/>
+          <w:i/>
+          <w:iCs/>
+          <w:color w:val="000000"/>
+          <w:sz w:val="24"/>
+          <w:szCs w:val="24"/>
+        </w:rPr>
+        <w:t xml:space="preserve">Acceso al registro de tienda de artesano</w:t>
+      </w:r>
+    </w:p>
+    <w:p>
+      <w:pPr>
+        <w:spacing w:after="40"/>
+        <w:jc w:val="center"/>
+      </w:pPr>
+      <w:r>
+        <w:drawing>
+          <wp:inline distT="0" distB="0" distL="0" distR="0">
+            <wp:extent cx="5486400" cy="3429000"/>
+            <wp:effectExtent t="0" r="0" b="0" l="0"/>
+            <wp:docPr id="1" name="" descr="" title=""/>
+            <wp:cNvGraphicFramePr>
+              <a:graphicFrameLocks xmlns:a="http://schemas.openxmlformats.org/drawingml/2006/main" noChangeAspect="1"/>
+            </wp:cNvGraphicFramePr>
+            <a:graphic xmlns:a="http://schemas.openxmlformats.org/drawingml/2006/main">
+              <a:graphicData uri="http://schemas.openxmlformats.org/drawingml/2006/picture">
+                <pic:pic xmlns:pic="http://schemas.openxmlformats.org/drawingml/2006/picture">
+                  <pic:nvPicPr>
+                    <pic:cNvPr id="0" name="" descr=""/>
+                    <pic:cNvPicPr>
+                      <a:picLocks noChangeAspect="1" noChangeArrowheads="1"/>
+                    </pic:cNvPicPr>
+                  </pic:nvPicPr>
+                  <pic:blipFill>
+                    <a:blip r:embed="rId15" cstate="none"/>
+                    <a:srcRect/>
+                    <a:stretch>
+                      <a:fillRect/>
+                    </a:stretch>
+                  </pic:blipFill>
+                  <pic:spPr bwMode="auto">
+                    <a:xfrm>
+                      <a:off x="0" y="0"/>
+                      <a:ext cx="5486400" cy="3429000"/>
+                    </a:xfrm>
+                    <a:prstGeom prst="rect">
+                      <a:avLst/>
+                    </a:prstGeom>
+                  </pic:spPr>
+                </pic:pic>
+              </a:graphicData>
+            </a:graphic>
+          </wp:inline>
+        </w:drawing>
+      </w:r>
+    </w:p>
+    <w:p>
+      <w:pPr>
+        <w:spacing w:after="200" w:line="240" w:lineRule="auto"/>
+      </w:pPr>
+      <w:r>
+        <w:rPr>
+          <w:rFonts w:ascii="Times New Roman" w:cs="Times New Roman" w:eastAsia="Times New Roman" w:hAnsi="Times New Roman"/>
+          <w:i/>
+          <w:iCs/>
+          <w:color w:val="000000"/>
+          <w:sz w:val="20"/>
+          <w:szCs w:val="20"/>
+        </w:rPr>
+        <w:t xml:space="preserve">Nota. </w:t>
+      </w:r>
+      <w:r>
+        <w:rPr>
+          <w:rFonts w:ascii="Times New Roman" w:cs="Times New Roman" w:eastAsia="Times New Roman" w:hAnsi="Times New Roman"/>
+          <w:color w:val="000000"/>
+          <w:sz w:val="20"/>
+          <w:szCs w:val="20"/>
+        </w:rPr>
+        <w:t xml:space="preserve">Punto de entrada al auto-registro de vendedor, ruta «/vendedor/registro».</w:t>
+      </w:r>
+    </w:p>
+    <w:p>
+      <w:pPr>
+        <w:spacing w:after="0" w:before="200" w:line="480" w:lineRule="auto"/>
+      </w:pPr>
+      <w:r>
+        <w:rPr>
+          <w:rFonts w:ascii="Times New Roman" w:cs="Times New Roman" w:eastAsia="Times New Roman" w:hAnsi="Times New Roman"/>
+          <w:b/>
+          <w:bCs/>
+          <w:color w:val="000000"/>
+          <w:sz w:val="24"/>
+          <w:szCs w:val="24"/>
+        </w:rPr>
+        <w:t xml:space="preserve">Figura 9</w:t>
+      </w:r>
+    </w:p>
+    <w:p>
+      <w:pPr>
+        <w:spacing w:after="80" w:line="480" w:lineRule="auto"/>
+      </w:pPr>
+      <w:r>
+        <w:rPr>
+          <w:rFonts w:ascii="Times New Roman" w:cs="Times New Roman" w:eastAsia="Times New Roman" w:hAnsi="Times New Roman"/>
+          <w:i/>
+          <w:iCs/>
+          <w:color w:val="000000"/>
+          <w:sz w:val="24"/>
+          <w:szCs w:val="24"/>
+        </w:rPr>
+        <w:t xml:space="preserve">Panel administrativo (dashboard)</w:t>
+      </w:r>
+    </w:p>
+    <w:p>
+      <w:pPr>
+        <w:spacing w:after="40"/>
+        <w:jc w:val="center"/>
+      </w:pPr>
+      <w:r>
+        <w:drawing>
+          <wp:inline distT="0" distB="0" distL="0" distR="0">
+            <wp:extent cx="5486400" cy="3429000"/>
+            <wp:effectExtent t="0" r="0" b="0" l="0"/>
+            <wp:docPr id="1" name="" descr="" title=""/>
+            <wp:cNvGraphicFramePr>
+              <a:graphicFrameLocks xmlns:a="http://schemas.openxmlformats.org/drawingml/2006/main" noChangeAspect="1"/>
+            </wp:cNvGraphicFramePr>
+            <a:graphic xmlns:a="http://schemas.openxmlformats.org/drawingml/2006/main">
+              <a:graphicData uri="http://schemas.openxmlformats.org/drawingml/2006/picture">
+                <pic:pic xmlns:pic="http://schemas.openxmlformats.org/drawingml/2006/picture">
+                  <pic:nvPicPr>
+                    <pic:cNvPr id="0" name="" descr=""/>
+                    <pic:cNvPicPr>
+                      <a:picLocks noChangeAspect="1" noChangeArrowheads="1"/>
+                    </pic:cNvPicPr>
+                  </pic:nvPicPr>
+                  <pic:blipFill>
+                    <a:blip r:embed="rId16" cstate="none"/>
+                    <a:srcRect/>
+                    <a:stretch>
+                      <a:fillRect/>
+                    </a:stretch>
+                  </pic:blipFill>
+                  <pic:spPr bwMode="auto">
+                    <a:xfrm>
+                      <a:off x="0" y="0"/>
+                      <a:ext cx="5486400" cy="3429000"/>
+                    </a:xfrm>
+                    <a:prstGeom prst="rect">
+                      <a:avLst/>
+                    </a:prstGeom>
+                  </pic:spPr>
+                </pic:pic>
+              </a:graphicData>
+            </a:graphic>
+          </wp:inline>
+        </w:drawing>
+      </w:r>
+    </w:p>
+    <w:p>
+      <w:pPr>
+        <w:spacing w:after="200" w:line="240" w:lineRule="auto"/>
+      </w:pPr>
+      <w:r>
+        <w:rPr>
+          <w:rFonts w:ascii="Times New Roman" w:cs="Times New Roman" w:eastAsia="Times New Roman" w:hAnsi="Times New Roman"/>
+          <w:i/>
+          <w:iCs/>
+          <w:color w:val="000000"/>
+          <w:sz w:val="20"/>
+          <w:szCs w:val="20"/>
+        </w:rPr>
+        <w:t xml:space="preserve">Nota. </w:t>
+      </w:r>
+      <w:r>
+        <w:rPr>
+          <w:rFonts w:ascii="Times New Roman" w:cs="Times New Roman" w:eastAsia="Times New Roman" w:hAnsi="Times New Roman"/>
+          <w:color w:val="000000"/>
+          <w:sz w:val="20"/>
+          <w:szCs w:val="20"/>
+        </w:rPr>
+        <w:t xml:space="preserve">Tablero de indicadores del administrador, ruta «/admin».</w:t>
+      </w:r>
+    </w:p>
+    <w:p>
+      <w:pPr>
+        <w:spacing w:after="0" w:before="200" w:line="480" w:lineRule="auto"/>
+      </w:pPr>
+      <w:r>
+        <w:rPr>
+          <w:rFonts w:ascii="Times New Roman" w:cs="Times New Roman" w:eastAsia="Times New Roman" w:hAnsi="Times New Roman"/>
+          <w:b/>
+          <w:bCs/>
+          <w:color w:val="000000"/>
+          <w:sz w:val="24"/>
+          <w:szCs w:val="24"/>
+        </w:rPr>
+        <w:t xml:space="preserve">Figura 10</w:t>
+      </w:r>
+    </w:p>
+    <w:p>
+      <w:pPr>
+        <w:spacing w:after="80" w:line="480" w:lineRule="auto"/>
+      </w:pPr>
+      <w:r>
+        <w:rPr>
+          <w:rFonts w:ascii="Times New Roman" w:cs="Times New Roman" w:eastAsia="Times New Roman" w:hAnsi="Times New Roman"/>
+          <w:i/>
+          <w:iCs/>
+          <w:color w:val="000000"/>
+          <w:sz w:val="24"/>
+          <w:szCs w:val="24"/>
+        </w:rPr>
+        <w:t xml:space="preserve">Panel de Vendedores y Comisiones</w:t>
+      </w:r>
+    </w:p>
+    <w:p>
+      <w:pPr>
+        <w:spacing w:after="40"/>
+        <w:jc w:val="center"/>
+      </w:pPr>
+      <w:r>
+        <w:drawing>
+          <wp:inline distT="0" distB="0" distL="0" distR="0">
+            <wp:extent cx="5486400" cy="3429000"/>
+            <wp:effectExtent t="0" r="0" b="0" l="0"/>
+            <wp:docPr id="1" name="" descr="" title=""/>
+            <wp:cNvGraphicFramePr>
+              <a:graphicFrameLocks xmlns:a="http://schemas.openxmlformats.org/drawingml/2006/main" noChangeAspect="1"/>
+            </wp:cNvGraphicFramePr>
+            <a:graphic xmlns:a="http://schemas.openxmlformats.org/drawingml/2006/main">
+              <a:graphicData uri="http://schemas.openxmlformats.org/drawingml/2006/picture">
+                <pic:pic xmlns:pic="http://schemas.openxmlformats.org/drawingml/2006/picture">
+                  <pic:nvPicPr>
+                    <pic:cNvPr id="0" name="" descr=""/>
+                    <pic:cNvPicPr>
+                      <a:picLocks noChangeAspect="1" noChangeArrowheads="1"/>
+                    </pic:cNvPicPr>
+                  </pic:nvPicPr>
+                  <pic:blipFill>
+                    <a:blip r:embed="rId17" cstate="none"/>
+                    <a:srcRect/>
+                    <a:stretch>
+                      <a:fillRect/>
+                    </a:stretch>
+                  </pic:blipFill>
+                  <pic:spPr bwMode="auto">
+                    <a:xfrm>
+                      <a:off x="0" y="0"/>
+                      <a:ext cx="5486400" cy="3429000"/>
+                    </a:xfrm>
+                    <a:prstGeom prst="rect">
+                      <a:avLst/>
+                    </a:prstGeom>
+                  </pic:spPr>
+                </pic:pic>
+              </a:graphicData>
+            </a:graphic>
+          </wp:inline>
+        </w:drawing>
+      </w:r>
+    </w:p>
+    <w:p>
+      <w:pPr>
+        <w:spacing w:after="200" w:line="240" w:lineRule="auto"/>
+      </w:pPr>
+      <w:r>
+        <w:rPr>
+          <w:rFonts w:ascii="Times New Roman" w:cs="Times New Roman" w:eastAsia="Times New Roman" w:hAnsi="Times New Roman"/>
+          <w:i/>
+          <w:iCs/>
+          <w:color w:val="000000"/>
+          <w:sz w:val="20"/>
+          <w:szCs w:val="20"/>
+        </w:rPr>
+        <w:t xml:space="preserve">Nota. </w:t>
+      </w:r>
+      <w:r>
+        <w:rPr>
+          <w:rFonts w:ascii="Times New Roman" w:cs="Times New Roman" w:eastAsia="Times New Roman" w:hAnsi="Times New Roman"/>
+          <w:color w:val="000000"/>
+          <w:sz w:val="20"/>
+          <w:szCs w:val="20"/>
+        </w:rPr>
+        <w:t xml:space="preserve">Configuración de la tasa de comisión y liquidación por vendedor, ruta «/admin/vendedores».</w:t>
+      </w:r>
+    </w:p>
+    <w:p>
+      <w:pPr>
+        <w:spacing w:after="0" w:before="200" w:line="480" w:lineRule="auto"/>
+      </w:pPr>
+      <w:r>
+        <w:rPr>
+          <w:rFonts w:ascii="Times New Roman" w:cs="Times New Roman" w:eastAsia="Times New Roman" w:hAnsi="Times New Roman"/>
+          <w:b/>
+          <w:bCs/>
+          <w:color w:val="000000"/>
+          <w:sz w:val="24"/>
+          <w:szCs w:val="24"/>
+        </w:rPr>
+        <w:t xml:space="preserve">Figura 11</w:t>
+      </w:r>
+    </w:p>
+    <w:p>
+      <w:pPr>
+        <w:spacing w:after="80" w:line="480" w:lineRule="auto"/>
+      </w:pPr>
+      <w:r>
+        <w:rPr>
+          <w:rFonts w:ascii="Times New Roman" w:cs="Times New Roman" w:eastAsia="Times New Roman" w:hAnsi="Times New Roman"/>
+          <w:i/>
+          <w:iCs/>
+          <w:color w:val="000000"/>
+          <w:sz w:val="24"/>
+          <w:szCs w:val="24"/>
+        </w:rPr>
+        <w:t xml:space="preserve">Reportes del módulo CRM</w:t>
+      </w:r>
+    </w:p>
+    <w:p>
+      <w:pPr>
+        <w:spacing w:after="40"/>
+        <w:jc w:val="center"/>
+      </w:pPr>
+      <w:r>
+        <w:drawing>
+          <wp:inline distT="0" distB="0" distL="0" distR="0">
+            <wp:extent cx="5486400" cy="3429000"/>
+            <wp:effectExtent t="0" r="0" b="0" l="0"/>
+            <wp:docPr id="1" name="" descr="" title=""/>
+            <wp:cNvGraphicFramePr>
+              <a:graphicFrameLocks xmlns:a="http://schemas.openxmlformats.org/drawingml/2006/main" noChangeAspect="1"/>
+            </wp:cNvGraphicFramePr>
+            <a:graphic xmlns:a="http://schemas.openxmlformats.org/drawingml/2006/main">
+              <a:graphicData uri="http://schemas.openxmlformats.org/drawingml/2006/picture">
+                <pic:pic xmlns:pic="http://schemas.openxmlformats.org/drawingml/2006/picture">
+                  <pic:nvPicPr>
+                    <pic:cNvPr id="0" name="" descr=""/>
+                    <pic:cNvPicPr>
+                      <a:picLocks noChangeAspect="1" noChangeArrowheads="1"/>
+                    </pic:cNvPicPr>
+                  </pic:nvPicPr>
+                  <pic:blipFill>
+                    <a:blip r:embed="rId18" cstate="none"/>
                     <a:srcRect/>
                     <a:stretch>
                       <a:fillRect/>

</xml_diff>